<commit_message>
Sync docs (generators + docx + CONTEXT_LOG/README) for the FY floor, delta and zone changes
Adds OD-13/14/15 to CONTEXT_LOG.md's decision log and regenerates all
three docs from the patched generators to reflect commit 5aaa8a9:
FY picker floored at 2026, growth pills hidden for the whole of FY 2026
rather than only under a scope filter, the map's zone shading reverted
to a hardcoded per-state table, and the choropleth's lightest/no-billing
colours darkened for contrast.
</commit_message>
<xml_diff>
--- a/UI5 Practice/Plant and Material Wise Sales dashboard/Documentation/PMS_Dashboard_Functional_Documentation.docx
+++ b/UI5 Practice/Plant and Material Wise Sales dashboard/Documentation/PMS_Dashboard_Functional_Documentation.docx
@@ -522,13 +522,13 @@
           <w:color w:val="2E7D32"/>
           <w:sz w:val="20"/>
         </w:rPr>
-        <w:t xml:space="preserve">Zone comes from ZSD_ZONE_PLANT, not from geography:  </w:t>
+        <w:t xml:space="preserve">Zone comes from ZSD_ZONE_PLANT for filtering; the map's own shading uses a fixed table:  </w:t>
       </w:r>
       <w:r>
         <w:rPr>
           <w:sz w:val="20"/>
         </w:rPr>
-        <w:t>A zone is a business grouping, not a map of India: 2000 HQ sits in Kanpur, in Uttar Pradesh, but belongs to Central. The dashboard therefore takes the zone from the ALM_ZONE code on the Unit's mapping row — the same field the Zone filter matches on — so filter and map always agree. If a Unit appears under the wrong zone, ALM_ZONE is what needs correcting.</w:t>
+        <w:t>A zone is a business grouping, not a map of India: 2000 HQ sits in Kanpur, in Uttar Pradesh, but belongs to Central. The Zone filter, the KPI totals and every panel besides the map itself still take the zone from the ALM_ZONE code on the Unit's mapping row, so filtering and totals always agree with each other. The map's own zone shading is the one exception (decided 2026-08-22): because ALM_ZONE kept surfacing states under the wrong zone in production, the map now shades each state from a fixed state-to-zone table built into the app, grouping all 36 states and union territories into ALIMCO's five zones. If a Unit's totals show under the wrong zone anywhere else on the screen, ALM_ZONE is what needs correcting; if only the map's own shading looks wrong for a state, the app's built-in table needs correcting instead.</w:t>
       </w:r>
     </w:p>
     <w:p>
@@ -674,7 +674,7 @@
     </w:p>
     <w:p>
       <w:r>
-        <w:t>Every figure is scoped to exactly one fiscal year, running April 1 to March 31. The dashboard opens on the fiscal year containing today's date and offers the three most recent years. The Period filter narrows within that year and is numbered the way the business counts it — Apr is period 1 and Mar is period 12.</w:t>
+        <w:t>Every figure is scoped to exactly one fiscal year, running April 1 to March 31. The dashboard opens on the fiscal year containing today's date and offers up to the three most recent years, floored at FY 2026 (decided 2026-08-22) — billing before that year carries no sales office and so cannot be grouped or filtered by zone at all. The Period filter narrows within the selected year and is numbered the way the business counts it — Apr is period 1 and Mar is period 12.</w:t>
       </w:r>
     </w:p>
     <w:p>
@@ -698,6 +698,29 @@
           <w:sz w:val="20"/>
         </w:rPr>
         <w:t>A fiscal year is named after the calendar year it STARTS in. April 2026 to March 2027 is fiscal year 2026, shown as “FY 2026-27”. This matches SAP's own GJAHR on the billing data.</w:t>
+      </w:r>
+    </w:p>
+    <w:p>
+      <w:pPr>
+        <w:spacing w:before="120" w:after="160"/>
+        <w:ind w:left="216"/>
+        <w:pBdr>
+          <w:left w:val="single" w:sz="18" w:space="6" w:color="2E7D32"/>
+        </w:pBdr>
+      </w:pPr>
+      <w:r>
+        <w:rPr>
+          <w:b/>
+          <w:color w:val="2E7D32"/>
+          <w:sz w:val="20"/>
+        </w:rPr>
+        <w:t xml:space="preserve">Why the picker does not always show three years (OD-13):  </w:t>
+      </w:r>
+      <w:r>
+        <w:rPr>
+          <w:sz w:val="20"/>
+        </w:rPr>
+        <w:t>Only fiscal years from FY 2026 onward are offered. Earlier billing has no sales office recorded, so it cannot be grouped into a zone or a Unit — selecting it would break every zone- and Unit-based view on the screen. The list will show three years again once FY 2028 makes FY 2026 the third year back, at which point every offered year is fully covered.</w:t>
       </w:r>
     </w:p>
     <w:p>
@@ -1185,7 +1208,7 @@
     </w:p>
     <w:p>
       <w:r>
-        <w:t>Four KPI cards sit above the panels. All four respect every active filter. The three money cards carry a growth pill comparing them against the previous fiscal year; the single-day card does not, and in FY 2026 the pills are hidden whenever a filter beyond Fiscal Year is set — both explained in 4.2.</w:t>
+        <w:t>Four KPI cards sit above the panels. All four respect every active filter. The three money cards carry a growth pill comparing them against the previous fiscal year; the single-day card does not, and in FY 2026 the pills are hidden outright, filtered or not — both explained in 4.2.</w:t>
       </w:r>
     </w:p>
     <w:p>
@@ -1533,18 +1556,18 @@
           <w:color w:val="2E7D32"/>
           <w:sz w:val="20"/>
         </w:rPr>
-        <w:t xml:space="preserve">In FY 2026, filtering hides every pill:  </w:t>
+        <w:t xml:space="preserve">In FY 2026, every pill is hidden — filtered or not (revised 2026-08-22, OD-14):  </w:t>
       </w:r>
       <w:r>
         <w:rPr>
           <w:sz w:val="20"/>
         </w:rPr>
-        <w:t>The sales-office grouping behind the Zone and Unit views only came into use in FY 2026. Most FY 2025 records do not carry one, so a filtered comparison measures a nearly complete year against a nearly empty one and reports growth in the thousands of percent. Rather than show a figure that cannot be trusted, the pills are hidden whenever FY 2026 is selected together with any of Zone, State, Plant, Scheme, Material or Period.</w:t>
+        <w:t>The sales-office grouping behind the Zone and Unit views only came into use in FY 2026, so most FY 2025 records do not carry one. That makes the FY 2025 comparison base unreliable on its own terms, not only once a filter narrows it — even the unfiltered FY 2026 total is measured against a prior year missing the grouping the rest of the dashboard depends on. Until 2026-08-18 the pills were hidden only when a filter beyond Fiscal Year was also set; that exemption for an FY-only view did not hold up, so the pills are now hidden for the whole of FY 2026 regardless of what else is filtered.</w:t>
       </w:r>
     </w:p>
     <w:p>
       <w:r>
-        <w:t>Fiscal Year on its own is deliberately not treated as such a filter. With nothing narrowing the view, both years total everything they hold, including the records with no sales office, so the comparison is sound and the pills stay. From FY 2027 the rule lapses by itself, because FY 2027 is compared against FY 2026, which carries the sales office throughout.</w:t>
+        <w:t>From FY 2027 this stops applying by itself, because FY 2027 is compared against FY 2026, which carries the sales office throughout.</w:t>
       </w:r>
     </w:p>
     <w:p>
@@ -2395,6 +2418,29 @@
     </w:p>
     <w:p>
       <w:pPr>
+        <w:spacing w:before="120" w:after="160"/>
+        <w:ind w:left="216"/>
+        <w:pBdr>
+          <w:left w:val="single" w:sz="18" w:space="6" w:color="2E7D32"/>
+        </w:pBdr>
+      </w:pPr>
+      <w:r>
+        <w:rPr>
+          <w:b/>
+          <w:color w:val="2E7D32"/>
+          <w:sz w:val="20"/>
+        </w:rPr>
+        <w:t xml:space="preserve">Lightest colours darkened for readability (2026-08-22):  </w:t>
+      </w:r>
+      <w:r>
+        <w:rPr>
+          <w:sz w:val="20"/>
+        </w:rPr>
+        <w:t>The palest step of the value scale and the separate "no billing" colour used to sit close enough to the panel's own white background that a barely-billed state and an unbilled state could both look blank. Both were darkened slightly so each is now visibly its own colour against the panel, as well as against each other.</w:t>
+      </w:r>
+    </w:p>
+    <w:p>
+      <w:pPr>
         <w:spacing w:before="160"/>
       </w:pPr>
       <w:r>
@@ -2450,6 +2496,29 @@
     <w:p>
       <w:r>
         <w:t>A ranked list rather than a chart. Each scheme shows a colour chip, its gross value, a progress bar of its share, the share percentage, the invoice count and its growth against last year. Hovering a row shows the net and tax behind that gross. Beneath a divider sits the Top-states roll-up. Every row is clickable and toggles that scheme — or that state — in the filter bar. Schemes with no gross value in the current selection are not listed.</w:t>
+      </w:r>
+    </w:p>
+    <w:p>
+      <w:pPr>
+        <w:spacing w:before="120" w:after="160"/>
+        <w:ind w:left="216"/>
+        <w:pBdr>
+          <w:left w:val="single" w:sz="18" w:space="6" w:color="2E7D32"/>
+        </w:pBdr>
+      </w:pPr>
+      <w:r>
+        <w:rPr>
+          <w:b/>
+          <w:color w:val="2E7D32"/>
+          <w:sz w:val="20"/>
+        </w:rPr>
+        <w:t xml:space="preserve">The panel's own subtitle follows the same rule as the pills:  </w:t>
+      </w:r>
+      <w:r>
+        <w:rPr>
+          <w:sz w:val="20"/>
+        </w:rPr>
+        <w:t>The subtitle above the list normally reads "Gross value by scheme · vs FY {year}". Whenever growth pills are hidden for the reason given in 4.2, it reads the plain "Gross value by scheme" instead, so the heading never promises a year-on-year comparison the rows underneath are not actually showing.</w:t>
       </w:r>
     </w:p>
     <w:p>
@@ -3612,7 +3681,7 @@
     </w:p>
     <w:p>
       <w:r>
-        <w:t>Check the prior year first. Where last year's figure is very small, a modest absolute movement produces an enormous percentage. Where last year's figure is zero, the pill shows “new” rather than a percentage at all. In FY 2026 the known case of this — a filtered view whose prior year has no sales office — is handled by hiding the pills outright; see 4.2.</w:t>
+        <w:t>Check the prior year first. Where last year's figure is very small, a modest absolute movement produces an enormous percentage. Where last year's figure is zero, the pill shows “new” rather than a percentage at all. In FY 2026 the known case of this — a prior year missing the sales-office grouping — is handled by hiding the pills outright for the whole year; see 4.2.</w:t>
       </w:r>
     </w:p>
     <w:p>
@@ -3625,12 +3694,12 @@
           <w:color w:val="22262A"/>
           <w:sz w:val="22"/>
         </w:rPr>
-        <w:t>The growth pills disappeared when I applied a filter.</w:t>
+        <w:t>The growth pills disappeared in FY 2026.</w:t>
       </w:r>
     </w:p>
     <w:p>
       <w:r>
-        <w:t>That is intended, and only happens in FY 2026. The comparison against FY 2025 is not reliable once the view is narrowed, because the sales-office grouping did not exist last year — see 4.2 for the full reason. Clear the filters, or select a different fiscal year, and they return. The figures themselves are unaffected; only the comparison is withheld.</w:t>
+        <w:t>That is intended. The comparison against FY 2025 is not reliable for the whole of FY 2026, because the sales-office grouping did not exist last year — see 4.2 for the full reason. This happens whether or not any other filter is set. Select a different fiscal year and they return. The figures themselves are unaffected; only the comparison is withheld.</w:t>
       </w:r>
     </w:p>
     <w:p>

</xml_diff>